<commit_message>
Actualizacion vista tecnicos y casos de uso
</commit_message>
<xml_diff>
--- a/Casos de Uso/CU-05-Bandeja_Tecnicos.docx
+++ b/Casos de Uso/CU-05-Bandeja_Tecnicos.docx
@@ -47,7 +47,23 @@
           <w:szCs w:val="36"/>
           <w:lang w:val="es-ES"/>
         </w:rPr>
-        <w:t xml:space="preserve">CU-04 Bandeja </w:t>
+        <w:t>CU-0</w:t>
+      </w:r>
+      <w:r>
+        <w:rPr>
+          <w:sz w:val="36"/>
+          <w:szCs w:val="36"/>
+          <w:lang w:val="es-ES"/>
+        </w:rPr>
+        <w:t>5</w:t>
+      </w:r>
+      <w:r>
+        <w:rPr>
+          <w:sz w:val="36"/>
+          <w:szCs w:val="36"/>
+          <w:lang w:val="es-ES"/>
+        </w:rPr>
+        <w:t xml:space="preserve"> Bandeja </w:t>
       </w:r>
       <w:r>
         <w:rPr>
@@ -1239,7 +1255,7 @@
           <w:szCs w:val="20"/>
           <w:lang w:val="es-ES_tradnl"/>
         </w:rPr>
-        <w:t xml:space="preserve">Reportes Ver </w:t>
+        <w:t xml:space="preserve">Mi Cuenta </w:t>
       </w:r>
       <w:r>
         <w:rPr>
@@ -1249,7 +1265,17 @@
           <w:szCs w:val="20"/>
           <w:lang w:val="es-ES_tradnl"/>
         </w:rPr>
-        <w:t>CU</w:t>
+        <w:t>Ver CU</w:t>
+      </w:r>
+      <w:r>
+        <w:rPr>
+          <w:b/>
+          <w:bCs/>
+          <w:sz w:val="20"/>
+          <w:szCs w:val="20"/>
+          <w:lang w:val="es-ES_tradnl"/>
+        </w:rPr>
+        <w:t>11</w:t>
       </w:r>
     </w:p>
     <w:p>
@@ -2145,16 +2171,6 @@
         </w:rPr>
         <w:t xml:space="preserve">"Guardar". </w:t>
       </w:r>
-      <w:r>
-        <w:rPr>
-          <w:b/>
-          <w:bCs/>
-          <w:sz w:val="20"/>
-          <w:szCs w:val="20"/>
-          <w:lang w:val="es-ES_tradnl"/>
-        </w:rPr>
-        <w:t>FA03</w:t>
-      </w:r>
     </w:p>
     <w:p>
       <w:pPr>
@@ -2190,7 +2206,6 @@
           <w:bCs/>
           <w:sz w:val="20"/>
           <w:szCs w:val="20"/>
-          <w:highlight w:val="yellow"/>
           <w:lang w:val="es-ES_tradnl"/>
         </w:rPr>
         <w:t>Ver</w:t>
@@ -2199,7 +2214,6 @@
         <w:rPr>
           <w:sz w:val="20"/>
           <w:szCs w:val="20"/>
-          <w:highlight w:val="yellow"/>
           <w:lang w:val="es-ES_tradnl"/>
         </w:rPr>
         <w:t xml:space="preserve"> </w:t>
@@ -2210,10 +2224,9 @@
           <w:bCs/>
           <w:sz w:val="20"/>
           <w:szCs w:val="20"/>
-          <w:highlight w:val="yellow"/>
-          <w:lang w:val="es-ES_tradnl"/>
-        </w:rPr>
-        <w:t>CU</w:t>
+          <w:lang w:val="es-ES_tradnl"/>
+        </w:rPr>
+        <w:t>CU13</w:t>
       </w:r>
     </w:p>
     <w:p>
@@ -2255,6 +2268,36 @@
           <w:lang w:val="es-ES_tradnl"/>
         </w:rPr>
         <w:t>5</w:t>
+      </w:r>
+      <w:r>
+        <w:rPr>
+          <w:b/>
+          <w:bCs/>
+          <w:sz w:val="20"/>
+          <w:szCs w:val="20"/>
+          <w:lang w:val="es-ES_tradnl"/>
+        </w:rPr>
+        <w:t xml:space="preserve"> o </w:t>
+      </w:r>
+      <w:r>
+        <w:rPr>
+          <w:b/>
+          <w:bCs/>
+          <w:sz w:val="20"/>
+          <w:szCs w:val="20"/>
+          <w:lang w:val="es-ES_tradnl"/>
+        </w:rPr>
+        <w:t xml:space="preserve">AN01 # </w:t>
+      </w:r>
+      <w:r>
+        <w:rPr>
+          <w:b/>
+          <w:bCs/>
+          <w:sz w:val="20"/>
+          <w:szCs w:val="20"/>
+          <w:lang w:val="es-ES_tradnl"/>
+        </w:rPr>
+        <w:t>6</w:t>
       </w:r>
     </w:p>
     <w:p>
@@ -3946,7 +3989,25 @@
           <w:lang w:val="es-ES_tradnl"/>
         </w:rPr>
         <w:lastRenderedPageBreak/>
-        <w:t>El sistema deberá aceptar únicamente pdf como evidencia</w:t>
+        <w:t xml:space="preserve">El sistema deberá aceptar únicamente </w:t>
+      </w:r>
+      <w:proofErr w:type="spellStart"/>
+      <w:r>
+        <w:rPr>
+          <w:sz w:val="20"/>
+          <w:szCs w:val="20"/>
+          <w:lang w:val="es-ES_tradnl"/>
+        </w:rPr>
+        <w:t>pdf</w:t>
+      </w:r>
+      <w:proofErr w:type="spellEnd"/>
+      <w:r>
+        <w:rPr>
+          <w:sz w:val="20"/>
+          <w:szCs w:val="20"/>
+          <w:lang w:val="es-ES_tradnl"/>
+        </w:rPr>
+        <w:t xml:space="preserve"> como evidencia</w:t>
       </w:r>
       <w:r>
         <w:rPr>

</xml_diff>

<commit_message>
Se corrige la reasignación de casos del jefe y supervisor, se añade regla de negocio
</commit_message>
<xml_diff>
--- a/Casos de Uso/CU-05-Bandeja_Tecnicos.docx
+++ b/Casos de Uso/CU-05-Bandeja_Tecnicos.docx
@@ -373,6 +373,13 @@
                 <w:lang w:val="es-GT"/>
               </w:rPr>
             </w:pPr>
+            <w:r>
+              <w:rPr>
+                <w:noProof/>
+                <w:lang w:val="es-GT"/>
+              </w:rPr>
+              <w:t xml:space="preserve">grupo 1 Análisis de Sistemas 2</w:t>
+            </w:r>
           </w:p>
         </w:tc>
         <w:tc>
@@ -391,6 +398,13 @@
                 <w:lang w:val="es-GT"/>
               </w:rPr>
             </w:pPr>
+            <w:r>
+              <w:rPr>
+                <w:noProof/>
+                <w:lang w:val="es-GT"/>
+              </w:rPr>
+              <w:t xml:space="preserve">13/10/2026</w:t>
+            </w:r>
           </w:p>
         </w:tc>
         <w:tc>
@@ -409,6 +423,13 @@
                 <w:lang w:val="es-GT"/>
               </w:rPr>
             </w:pPr>
+            <w:r>
+              <w:rPr>
+                <w:noProof/>
+                <w:lang w:val="es-GT"/>
+              </w:rPr>
+              <w:t xml:space="preserve">Actualización de las referencias a los casos de uso renumerados</w:t>
+            </w:r>
           </w:p>
         </w:tc>
         <w:tc>
@@ -428,6 +449,13 @@
                 <w:lang w:val="es-GT"/>
               </w:rPr>
             </w:pPr>
+            <w:r>
+              <w:rPr>
+                <w:noProof/>
+                <w:lang w:val="es-GT"/>
+              </w:rPr>
+              <w:t xml:space="preserve">1.0</w:t>
+            </w:r>
           </w:p>
         </w:tc>
       </w:tr>
@@ -2226,7 +2254,7 @@
           <w:szCs w:val="20"/>
           <w:lang w:val="es-ES_tradnl"/>
         </w:rPr>
-        <w:t>CU13</w:t>
+        <w:t xml:space="preserve">CU12</w:t>
       </w:r>
     </w:p>
     <w:p>

</xml_diff>